<commit_message>
fix(resume): use Arial for docx theme font
The reference.docx theme hardcoded Aptos/Aptos Display, which only ship
with current Microsoft 365, so other viewers reported missing fonts and
substituted. Arial is preinstalled on every OS and Google Docs, so the
docx renders consistently with no missing-font warnings.
</commit_message>
<xml_diff>
--- a/tools/resume/reference.docx
+++ b/tools/resume/reference.docx
@@ -1190,7 +1190,7 @@
     </a:clrScheme>
     <a:fontScheme name="Office">
       <a:majorFont>
-        <a:latin typeface="Aptos Display" panose="02110004020202020204"/>
+        <a:latin typeface="Arial" panose="02110004020202020204"/>
         <a:ea typeface=""/>
         <a:cs typeface=""/>
         <a:font script="Jpan" typeface="游ゴシック Light"/>
@@ -1242,7 +1242,7 @@
         <a:font script="Tfng" typeface="Ebrima"/>
       </a:majorFont>
       <a:minorFont>
-        <a:latin typeface="Aptos" panose="02110004020202020204"/>
+        <a:latin typeface="Arial" panose="02110004020202020204"/>
         <a:ea typeface=""/>
         <a:cs typeface=""/>
         <a:font script="Jpan" typeface="游明朝"/>

</xml_diff>